<commit_message>
chore: monthly cheatsheet update 2026-10
Key changes:
- §6 Prompt caching TTL corrected 5 min → 1 hr (API change Sep 2026)
- §6 Added Sonnet 5.5 pricing ($2/$10/M, $0.20/M cached)
- §7 Added on-demand compaction via Messages API
- §12 Added Sonnet 5.5 default model bullet (1M ctx)
- §13 Rewrote MCP section to cover Code Execution tool, Files API (GA Aug 2026), API MCP Connector, inline tools beta
- §16 Added Files API and code_execution branches to decision tree
- CHANGELOG.md created

Co-Authored-By: Claude Sonnet 4.6 <noreply@anthropic.com>
Claude-Session: https://claude.ai/code/session_01KuksyyoSUZZTXvQNvFYhad
</commit_message>
<xml_diff>
--- a/claude_power_user_cheatsheet.docx
+++ b/claude_power_user_cheatsheet.docx
@@ -622,19 +622,6 @@
                       <w:sz w:val="13"/>
                       <w:szCs w:val="13"/>
                     </w:rPr>
-                    <w:t xml:space="preserve"/>
-                  </w:r>
-                </w:p>
-                <w:p>
-                  <w:pPr>
-                    <w:spacing w:after="0" w:before="0"/>
-                  </w:pPr>
-                  <w:r>
-                    <w:rPr>
-                      <w:rFonts w:ascii="Courier New" w:cs="Courier New" w:eastAsia="Courier New" w:hAnsi="Courier New"/>
-                      <w:sz w:val="13"/>
-                      <w:szCs w:val="13"/>
-                    </w:rPr>
                     <w:t xml:space="preserve"># Structured JSON output</w:t>
                   </w:r>
                 </w:p>
@@ -649,19 +636,6 @@
                       <w:szCs w:val="13"/>
                     </w:rPr>
                     <w:t xml:space="preserve">claude --output-format json --print 'prompt'</w:t>
-                  </w:r>
-                </w:p>
-                <w:p>
-                  <w:pPr>
-                    <w:spacing w:after="0" w:before="0"/>
-                  </w:pPr>
-                  <w:r>
-                    <w:rPr>
-                      <w:rFonts w:ascii="Courier New" w:cs="Courier New" w:eastAsia="Courier New" w:hAnsi="Courier New"/>
-                      <w:sz w:val="13"/>
-                      <w:szCs w:val="13"/>
-                    </w:rPr>
-                    <w:t xml:space="preserve"/>
                   </w:r>
                 </w:p>
                 <w:p>
@@ -1039,7 +1013,7 @@
                       <w:sz w:val="13"/>
                       <w:szCs w:val="13"/>
                     </w:rPr>
-                    <w:t xml:space="preserve">                &lt;-- 5-min TTL; 90% savings on cache hits --&gt;</w:t>
+                    <w:t xml:space="preserve">                &lt;-- 1-hr TTL; 90% savings on cache hits --&gt;</w:t>
                   </w:r>
                 </w:p>
                 <w:p>
@@ -1091,7 +1065,7 @@
                 <w:sz w:val="14"/>
                 <w:szCs w:val="14"/>
               </w:rPr>
-              <w:t xml:space="preserve">5-min TTL: sleeping &gt;300s = cold cache on next turn (pay full price)</w:t>
+              <w:t xml:space="preserve">1-hr TTL: idle &gt;3600s = cold cache; Sonnet 5.5: $2/$10/M, cached $0.20/M</w:t>
             </w:r>
           </w:p>
           <w:p>
@@ -1297,6 +1271,24 @@
                 <w:szCs w:val="14"/>
               </w:rPr>
               <w:t xml:space="preserve">Long tasks: checkpoint to files every ~10 major steps</w:t>
+            </w:r>
+          </w:p>
+          <w:p>
+            <w:pPr>
+              <w:pStyle w:val="ListParagraph"/>
+              <w:numPr>
+                <w:ilvl w:val="0"/>
+                <w:numId w:val="2"/>
+              </w:numPr>
+              <w:spacing w:after="6" w:before="6"/>
+            </w:pPr>
+            <w:r>
+              <w:rPr>
+                <w:rFonts w:ascii="Arial" w:cs="Arial" w:eastAsia="Arial" w:hAnsi="Arial"/>
+                <w:sz w:val="14"/>
+                <w:szCs w:val="14"/>
+              </w:rPr>
+              <w:t xml:space="preserve">API: POST /v1/messages with type:compact → signed block replaces prior turns</w:t>
             </w:r>
           </w:p>
         </w:tc>
@@ -1479,19 +1471,6 @@
                       <w:sz w:val="13"/>
                       <w:szCs w:val="13"/>
                     </w:rPr>
-                    <w:t xml:space="preserve">// Model re-reasons after every tool result</w:t>
-                  </w:r>
-                </w:p>
-                <w:p>
-                  <w:pPr>
-                    <w:spacing w:after="0" w:before="0"/>
-                  </w:pPr>
-                  <w:r>
-                    <w:rPr>
-                      <w:rFonts w:ascii="Courier New" w:cs="Courier New" w:eastAsia="Courier New" w:hAnsi="Courier New"/>
-                      <w:sz w:val="13"/>
-                      <w:szCs w:val="13"/>
-                    </w:rPr>
                     <w:t xml:space="preserve">betas: ['interleaved-thinking-2025-05-14']</w:t>
                   </w:r>
                 </w:p>
@@ -1526,7 +1505,7 @@
                 <w:sz w:val="14"/>
                 <w:szCs w:val="14"/>
               </w:rPr>
-              <w:t xml:space="preserve">Best for: multi-step reasoning, math, long planning chains</w:t>
+              <w:t xml:space="preserve">Best for: multi-step reasoning, math, strategic planning chains</w:t>
             </w:r>
           </w:p>
           <w:p>
@@ -1684,19 +1663,6 @@
                       <w:sz w:val="13"/>
                       <w:szCs w:val="13"/>
                     </w:rPr>
-                    <w:t xml:space="preserve">Agent({ prompt: 'task C', run_in_background: true })</w:t>
-                  </w:r>
-                </w:p>
-                <w:p>
-                  <w:pPr>
-                    <w:spacing w:after="0" w:before="0"/>
-                  </w:pPr>
-                  <w:r>
-                    <w:rPr>
-                      <w:rFonts w:ascii="Courier New" w:cs="Courier New" w:eastAsia="Courier New" w:hAnsi="Courier New"/>
-                      <w:sz w:val="13"/>
-                      <w:szCs w:val="13"/>
-                    </w:rPr>
                     <w:t xml:space="preserve">// Opus supervises -&gt; Sonnet workers in isolated contexts</w:t>
                   </w:r>
                 </w:p>
@@ -1773,7 +1739,7 @@
                 <w:sz w:val="14"/>
                 <w:szCs w:val="14"/>
               </w:rPr>
-              <w:t xml:space="preserve">N workers x full context size = N times token burn — size matters</w:t>
+              <w:t xml:space="preserve">N workers x full context = N times token burn — size matters</w:t>
             </w:r>
           </w:p>
           <w:p>
@@ -1962,33 +1928,20 @@
                       <w:sz w:val="13"/>
                       <w:szCs w:val="13"/>
                     </w:rPr>
-                    <w:t xml:space="preserve">// Auto-cleaned if agent makes no changes</w:t>
-                  </w:r>
-                </w:p>
-                <w:p>
-                  <w:pPr>
-                    <w:spacing w:after="0" w:before="0"/>
-                  </w:pPr>
-                  <w:r>
-                    <w:rPr>
-                      <w:rFonts w:ascii="Courier New" w:cs="Courier New" w:eastAsia="Courier New" w:hAnsi="Courier New"/>
-                      <w:sz w:val="13"/>
-                      <w:szCs w:val="13"/>
-                    </w:rPr>
-                    <w:t xml:space="preserve">// Returns branch path + name if changes were made</w:t>
-                  </w:r>
-                </w:p>
-                <w:p>
-                  <w:pPr>
-                    <w:spacing w:after="0" w:before="0"/>
-                  </w:pPr>
-                  <w:r>
-                    <w:rPr>
-                      <w:rFonts w:ascii="Courier New" w:cs="Courier New" w:eastAsia="Courier New" w:hAnsi="Courier New"/>
-                      <w:sz w:val="13"/>
-                      <w:szCs w:val="13"/>
-                    </w:rPr>
-                    <w:t xml:space="preserve">// Prevents parallel workers stomping each other</w:t>
+                    <w:t xml:space="preserve">// Auto-cleaned if no changes made</w:t>
+                  </w:r>
+                </w:p>
+                <w:p>
+                  <w:pPr>
+                    <w:spacing w:after="0" w:before="0"/>
+                  </w:pPr>
+                  <w:r>
+                    <w:rPr>
+                      <w:rFonts w:ascii="Courier New" w:cs="Courier New" w:eastAsia="Courier New" w:hAnsi="Courier New"/>
+                      <w:sz w:val="13"/>
+                      <w:szCs w:val="13"/>
+                    </w:rPr>
+                    <w:t xml:space="preserve">// Returns branch path if changes were made</w:t>
                   </w:r>
                 </w:p>
               </w:tc>
@@ -2868,6 +2821,24 @@
                 <w:sz w:val="14"/>
                 <w:szCs w:val="14"/>
               </w:rPr>
+              <w:t xml:space="preserve">Sonnet 5.5 (default): 1M ctx, $2/$10/M in/out, $0.20/M cached reads</w:t>
+            </w:r>
+          </w:p>
+          <w:p>
+            <w:pPr>
+              <w:pStyle w:val="ListParagraph"/>
+              <w:numPr>
+                <w:ilvl w:val="0"/>
+                <w:numId w:val="2"/>
+              </w:numPr>
+              <w:spacing w:after="6" w:before="6"/>
+            </w:pPr>
+            <w:r>
+              <w:rPr>
+                <w:rFonts w:ascii="Arial" w:cs="Arial" w:eastAsia="Arial" w:hAnsi="Arial"/>
+                <w:sz w:val="14"/>
+                <w:szCs w:val="14"/>
+              </w:rPr>
               <w:t xml:space="preserve">T5 orchestrator via subscription ONLY: Agent(model='opus')</w:t>
             </w:r>
           </w:p>
@@ -2905,7 +2876,7 @@
                 <w:sz w:val="17"/>
                 <w:szCs w:val="17"/>
               </w:rPr>
-              <w:t xml:space="preserve">13 · MCP Servers — Universal Pattern</w:t>
+              <w:t xml:space="preserve">13 · MCP + New API Tools</w:t>
             </w:r>
           </w:p>
           <w:tbl>
@@ -2951,85 +2922,85 @@
                       <w:sz w:val="13"/>
                       <w:szCs w:val="13"/>
                     </w:rPr>
-                    <w:t xml:space="preserve">Claude Code</w:t>
-                  </w:r>
-                </w:p>
-                <w:p>
-                  <w:pPr>
-                    <w:spacing w:after="0" w:before="0"/>
-                  </w:pPr>
-                  <w:r>
-                    <w:rPr>
-                      <w:rFonts w:ascii="Courier New" w:cs="Courier New" w:eastAsia="Courier New" w:hAnsi="Courier New"/>
-                      <w:sz w:val="13"/>
-                      <w:szCs w:val="13"/>
-                    </w:rPr>
-                    <w:t xml:space="preserve">    +--&gt; MCP client</w:t>
-                  </w:r>
-                </w:p>
-                <w:p>
-                  <w:pPr>
-                    <w:spacing w:after="0" w:before="0"/>
-                  </w:pPr>
-                  <w:r>
-                    <w:rPr>
-                      <w:rFonts w:ascii="Courier New" w:cs="Courier New" w:eastAsia="Courier New" w:hAnsi="Courier New"/>
-                      <w:sz w:val="13"/>
-                      <w:szCs w:val="13"/>
-                    </w:rPr>
-                    <w:t xml:space="preserve">             +--&gt; browser automation server</w:t>
-                  </w:r>
-                </w:p>
-                <w:p>
-                  <w:pPr>
-                    <w:spacing w:after="0" w:before="0"/>
-                  </w:pPr>
-                  <w:r>
-                    <w:rPr>
-                      <w:rFonts w:ascii="Courier New" w:cs="Courier New" w:eastAsia="Courier New" w:hAnsi="Courier New"/>
-                      <w:sz w:val="13"/>
-                      <w:szCs w:val="13"/>
-                    </w:rPr>
-                    <w:t xml:space="preserve">             +--&gt; file system / database server</w:t>
-                  </w:r>
-                </w:p>
-                <w:p>
-                  <w:pPr>
-                    <w:spacing w:after="0" w:before="0"/>
-                  </w:pPr>
-                  <w:r>
-                    <w:rPr>
-                      <w:rFonts w:ascii="Courier New" w:cs="Courier New" w:eastAsia="Courier New" w:hAnsi="Courier New"/>
-                      <w:sz w:val="13"/>
-                      <w:szCs w:val="13"/>
-                    </w:rPr>
-                    <w:t xml:space="preserve">             +--&gt; external APIs (email, calendar, ...)</w:t>
-                  </w:r>
-                </w:p>
-                <w:p>
-                  <w:pPr>
-                    <w:spacing w:after="0" w:before="0"/>
-                  </w:pPr>
-                  <w:r>
-                    <w:rPr>
-                      <w:rFonts w:ascii="Courier New" w:cs="Courier New" w:eastAsia="Courier New" w:hAnsi="Courier New"/>
-                      <w:sz w:val="13"/>
-                      <w:szCs w:val="13"/>
-                    </w:rPr>
-                    <w:t xml:space="preserve">             +--&gt; custom domain tools (KB, lit, ...)</w:t>
-                  </w:r>
-                </w:p>
-                <w:p>
-                  <w:pPr>
-                    <w:spacing w:after="0" w:before="0"/>
-                  </w:pPr>
-                  <w:r>
-                    <w:rPr>
-                      <w:rFonts w:ascii="Courier New" w:cs="Courier New" w:eastAsia="Courier New" w:hAnsi="Courier New"/>
-                      <w:sz w:val="13"/>
-                      <w:szCs w:val="13"/>
-                    </w:rPr>
-                    <w:t xml:space="preserve">Configure: .claude/settings.json -&gt; mcpServers</w:t>
+                    <w:t xml:space="preserve">// Claude Code MCP (.claude/settings.json)</w:t>
+                  </w:r>
+                </w:p>
+                <w:p>
+                  <w:pPr>
+                    <w:spacing w:after="0" w:before="0"/>
+                  </w:pPr>
+                  <w:r>
+                    <w:rPr>
+                      <w:rFonts w:ascii="Courier New" w:cs="Courier New" w:eastAsia="Courier New" w:hAnsi="Courier New"/>
+                      <w:sz w:val="13"/>
+                      <w:szCs w:val="13"/>
+                    </w:rPr>
+                    <w:t xml:space="preserve">mcpServers: { srv: { command, args, env } }</w:t>
+                  </w:r>
+                </w:p>
+                <w:p>
+                  <w:pPr>
+                    <w:spacing w:after="0" w:before="0"/>
+                  </w:pPr>
+                  <w:r>
+                    <w:rPr>
+                      <w:rFonts w:ascii="Courier New" w:cs="Courier New" w:eastAsia="Courier New" w:hAnsi="Courier New"/>
+                      <w:sz w:val="13"/>
+                      <w:szCs w:val="13"/>
+                    </w:rPr>
+                    <w:t xml:space="preserve">// API MCP Connector (no client code needed)</w:t>
+                  </w:r>
+                </w:p>
+                <w:p>
+                  <w:pPr>
+                    <w:spacing w:after="0" w:before="0"/>
+                  </w:pPr>
+                  <w:r>
+                    <w:rPr>
+                      <w:rFonts w:ascii="Courier New" w:cs="Courier New" w:eastAsia="Courier New" w:hAnsi="Courier New"/>
+                      <w:sz w:val="13"/>
+                      <w:szCs w:val="13"/>
+                    </w:rPr>
+                    <w:t xml:space="preserve">mcp_servers: [{ type: 'url', url: '...', name: 'srv' }]</w:t>
+                  </w:r>
+                </w:p>
+                <w:p>
+                  <w:pPr>
+                    <w:spacing w:after="0" w:before="0"/>
+                  </w:pPr>
+                  <w:r>
+                    <w:rPr>
+                      <w:rFonts w:ascii="Courier New" w:cs="Courier New" w:eastAsia="Courier New" w:hAnsi="Courier New"/>
+                      <w:sz w:val="13"/>
+                      <w:szCs w:val="13"/>
+                    </w:rPr>
+                    <w:t xml:space="preserve">// Code Execution (sandboxed Python, 90s/cell)</w:t>
+                  </w:r>
+                </w:p>
+                <w:p>
+                  <w:pPr>
+                    <w:spacing w:after="0" w:before="0"/>
+                  </w:pPr>
+                  <w:r>
+                    <w:rPr>
+                      <w:rFonts w:ascii="Courier New" w:cs="Courier New" w:eastAsia="Courier New" w:hAnsi="Courier New"/>
+                      <w:sz w:val="13"/>
+                      <w:szCs w:val="13"/>
+                    </w:rPr>
+                    <w:t xml:space="preserve">tools: [{ type: 'code_execution_20260521' }]</w:t>
+                  </w:r>
+                </w:p>
+                <w:p>
+                  <w:pPr>
+                    <w:spacing w:after="0" w:before="0"/>
+                  </w:pPr>
+                  <w:r>
+                    <w:rPr>
+                      <w:rFonts w:ascii="Courier New" w:cs="Courier New" w:eastAsia="Courier New" w:hAnsi="Courier New"/>
+                      <w:sz w:val="13"/>
+                      <w:szCs w:val="13"/>
+                    </w:rPr>
+                    <w:t xml:space="preserve">// Files API: upload once, reuse by file_id</w:t>
                   </w:r>
                 </w:p>
               </w:tc>
@@ -3050,25 +3021,61 @@
                 <w:sz w:val="14"/>
                 <w:szCs w:val="14"/>
               </w:rPr>
-              <w:t xml:space="preserve">MCP = Model Context Protocol: tools injected at runtime</w:t>
-            </w:r>
-          </w:p>
-          <w:p>
-            <w:pPr>
-              <w:pStyle w:val="ListParagraph"/>
-              <w:numPr>
-                <w:ilvl w:val="0"/>
-                <w:numId w:val="2"/>
-              </w:numPr>
-              <w:spacing w:after="6" w:before="6"/>
-            </w:pPr>
-            <w:r>
-              <w:rPr>
-                <w:rFonts w:ascii="Arial" w:cs="Arial" w:eastAsia="Arial" w:hAnsi="Arial"/>
-                <w:sz w:val="14"/>
-                <w:szCs w:val="14"/>
-              </w:rPr>
-              <w:t xml:space="preserve">Each server exposes tools + resources Claude calls natively</w:t>
+              <w:t xml:space="preserve">MCP Connector (API): tools only — resources/prompts not yet supported</w:t>
+            </w:r>
+          </w:p>
+          <w:p>
+            <w:pPr>
+              <w:pStyle w:val="ListParagraph"/>
+              <w:numPr>
+                <w:ilvl w:val="0"/>
+                <w:numId w:val="2"/>
+              </w:numPr>
+              <w:spacing w:after="6" w:before="6"/>
+            </w:pPr>
+            <w:r>
+              <w:rPr>
+                <w:rFonts w:ascii="Arial" w:cs="Arial" w:eastAsia="Arial" w:hAnsi="Arial"/>
+                <w:sz w:val="14"/>
+                <w:szCs w:val="14"/>
+              </w:rPr>
+              <w:t xml:space="preserve">Code Execution: Claude runs Python, iterates inline with your tools</w:t>
+            </w:r>
+          </w:p>
+          <w:p>
+            <w:pPr>
+              <w:pStyle w:val="ListParagraph"/>
+              <w:numPr>
+                <w:ilvl w:val="0"/>
+                <w:numId w:val="2"/>
+              </w:numPr>
+              <w:spacing w:after="6" w:before="6"/>
+            </w:pPr>
+            <w:r>
+              <w:rPr>
+                <w:rFonts w:ascii="Arial" w:cs="Arial" w:eastAsia="Arial" w:hAnsi="Arial"/>
+                <w:sz w:val="14"/>
+                <w:szCs w:val="14"/>
+              </w:rPr>
+              <w:t xml:space="preserve">Files API (GA Aug 2026): 500 MB/file, 1 TB org — ref across requests</w:t>
+            </w:r>
+          </w:p>
+          <w:p>
+            <w:pPr>
+              <w:pStyle w:val="ListParagraph"/>
+              <w:numPr>
+                <w:ilvl w:val="0"/>
+                <w:numId w:val="2"/>
+              </w:numPr>
+              <w:spacing w:after="6" w:before="6"/>
+            </w:pPr>
+            <w:r>
+              <w:rPr>
+                <w:rFonts w:ascii="Arial" w:cs="Arial" w:eastAsia="Arial" w:hAnsi="Arial"/>
+                <w:sz w:val="14"/>
+                <w:szCs w:val="14"/>
+              </w:rPr>
+              <w:t xml:space="preserve">Inline tools beta: define tools in mid-convo system msg (inline-tools-2026-09-15)</w:t>
             </w:r>
           </w:p>
           <w:p>
@@ -3224,25 +3231,25 @@
                 <w:sz w:val="14"/>
                 <w:szCs w:val="14"/>
               </w:rPr>
-              <w:t xml:space="preserve">Failure mode: memory names file X -&gt; grep first (may be renamed/gone)</w:t>
-            </w:r>
-          </w:p>
-          <w:p>
-            <w:pPr>
-              <w:pStyle w:val="ListParagraph"/>
-              <w:numPr>
-                <w:ilvl w:val="0"/>
-                <w:numId w:val="2"/>
-              </w:numPr>
-              <w:spacing w:after="6" w:before="6"/>
-            </w:pPr>
-            <w:r>
-              <w:rPr>
-                <w:rFonts w:ascii="Arial" w:cs="Arial" w:eastAsia="Arial" w:hAnsi="Arial"/>
-                <w:sz w:val="14"/>
-                <w:szCs w:val="14"/>
-              </w:rPr>
-              <w:t xml:space="preserve">Failure mode: memory says 'active' -&gt; read STATUS.md (may be stale)</w:t>
+              <w:t xml:space="preserve">Failure: memory names file X -&gt; grep first (may be renamed/gone)</w:t>
+            </w:r>
+          </w:p>
+          <w:p>
+            <w:pPr>
+              <w:pStyle w:val="ListParagraph"/>
+              <w:numPr>
+                <w:ilvl w:val="0"/>
+                <w:numId w:val="2"/>
+              </w:numPr>
+              <w:spacing w:after="6" w:before="6"/>
+            </w:pPr>
+            <w:r>
+              <w:rPr>
+                <w:rFonts w:ascii="Arial" w:cs="Arial" w:eastAsia="Arial" w:hAnsi="Arial"/>
+                <w:sz w:val="14"/>
+                <w:szCs w:val="14"/>
+              </w:rPr>
+              <w:t xml:space="preserve">Failure: memory says 'active' -&gt; read STATUS.md (may be stale)</w:t>
             </w:r>
           </w:p>
           <w:p>
@@ -3393,19 +3400,6 @@
                     <w:t xml:space="preserve">  Next:     context needed to resume cleanly</w:t>
                   </w:r>
                 </w:p>
-                <w:p>
-                  <w:pPr>
-                    <w:spacing w:after="0" w:before="0"/>
-                  </w:pPr>
-                  <w:r>
-                    <w:rPr>
-                      <w:rFonts w:ascii="Courier New" w:cs="Courier New" w:eastAsia="Courier New" w:hAnsi="Courier New"/>
-                      <w:sz w:val="13"/>
-                      <w:szCs w:val="13"/>
-                    </w:rPr>
-                    <w:t xml:space="preserve">Reasoning matters more than artifact lists.</w:t>
-                  </w:r>
-                </w:p>
               </w:tc>
             </w:tr>
           </w:tbl>
@@ -3533,6 +3527,32 @@
                       <w:sz w:val="13"/>
                       <w:szCs w:val="13"/>
                     </w:rPr>
+                    <w:t xml:space="preserve">Reusing a file across calls? -&gt; Files API (file_id)</w:t>
+                  </w:r>
+                </w:p>
+                <w:p>
+                  <w:pPr>
+                    <w:spacing w:after="0" w:before="0"/>
+                  </w:pPr>
+                  <w:r>
+                    <w:rPr>
+                      <w:rFonts w:ascii="Courier New" w:cs="Courier New" w:eastAsia="Courier New" w:hAnsi="Courier New"/>
+                      <w:sz w:val="13"/>
+                      <w:szCs w:val="13"/>
+                    </w:rPr>
+                    <w:t xml:space="preserve">Need Python compute?   -&gt; code_execution tool (not Bash)</w:t>
+                  </w:r>
+                </w:p>
+                <w:p>
+                  <w:pPr>
+                    <w:spacing w:after="0" w:before="0"/>
+                  </w:pPr>
+                  <w:r>
+                    <w:rPr>
+                      <w:rFonts w:ascii="Courier New" w:cs="Courier New" w:eastAsia="Courier New" w:hAnsi="Courier New"/>
+                      <w:sz w:val="13"/>
+                      <w:szCs w:val="13"/>
+                    </w:rPr>
                     <w:t xml:space="preserve">Independent subtasks?  -&gt; parallel agents (1 message)</w:t>
                   </w:r>
                 </w:p>
@@ -3560,19 +3580,6 @@
                       <w:szCs w:val="13"/>
                     </w:rPr>
                     <w:t xml:space="preserve">Needs orchestrator?    -&gt; Agent(model='opus'), sub only</w:t>
-                  </w:r>
-                </w:p>
-                <w:p>
-                  <w:pPr>
-                    <w:spacing w:after="0" w:before="0"/>
-                  </w:pPr>
-                  <w:r>
-                    <w:rPr>
-                      <w:rFonts w:ascii="Courier New" w:cs="Courier New" w:eastAsia="Courier New" w:hAnsi="Courier New"/>
-                      <w:sz w:val="13"/>
-                      <w:szCs w:val="13"/>
-                    </w:rPr>
-                    <w:t xml:space="preserve">Pushing code?          -&gt; explicit 'go' each exchange</w:t>
                   </w:r>
                 </w:p>
                 <w:p>
@@ -3603,10 +3610,6 @@
     </w:sectPr>
   </w:body>
 </w:document>
-</file>
-
-<file path=word/comments.xml><?xml version="1.0" encoding="utf-8"?>
-<w:comments xmlns:cx="http://schemas.microsoft.com/office/drawing/2014/chartex" xmlns:cx1="http://schemas.microsoft.com/office/drawing/2015/9/8/chartex" xmlns:cx2="http://schemas.microsoft.com/office/drawing/2015/10/21/chartex" xmlns:cx3="http://schemas.microsoft.com/office/drawing/2016/5/9/chartex" xmlns:cx4="http://schemas.microsoft.com/office/drawing/2016/5/10/chartex" xmlns:cx5="http://schemas.microsoft.com/office/drawing/2016/5/11/chartex" xmlns:cx6="http://schemas.microsoft.com/office/drawing/2016/5/12/chartex" xmlns:cx7="http://schemas.microsoft.com/office/drawing/2016/5/13/chartex" xmlns:cx8="http://schemas.microsoft.com/office/drawing/2016/5/14/chartex" xmlns:mc="http://schemas.openxmlformats.org/markup-compatibility/2006" xmlns:aink="http://schemas.microsoft.com/office/drawing/2016/ink" xmlns:am3d="http://schemas.microsoft.com/office/drawing/2017/model3d" xmlns:o="urn:schemas-microsoft-com:office:office" xmlns:r="http://schemas.openxmlformats.org/officeDocument/2006/relationships" xmlns:m="http://schemas.openxmlformats.org/officeDocument/2006/math" xmlns:v="urn:schemas-microsoft-com:vml" xmlns:wp14="http://schemas.microsoft.com/office/word/2010/wordprocessingDrawing" xmlns:wp="http://schemas.openxmlformats.org/drawingml/2006/wordprocessingDrawing" xmlns:w10="urn:schemas-microsoft-com:office:word" xmlns:w="http://schemas.openxmlformats.org/wordprocessingml/2006/main" xmlns:w14="http://schemas.microsoft.com/office/word/2010/wordml" xmlns:w15="http://schemas.microsoft.com/office/word/2012/wordml" xmlns:w16cex="http://schemas.microsoft.com/office/word/2018/wordml/cex" xmlns:w16cid="http://schemas.microsoft.com/office/word/2016/wordml/cid" xmlns:w16="http://schemas.microsoft.com/office/word/2018/wordml" xmlns:w16sdtdh="http://schemas.microsoft.com/office/word/2020/wordml/sdtdatahash" xmlns:w16se="http://schemas.microsoft.com/office/word/2015/wordml/symex" xmlns:wpg="http://schemas.microsoft.com/office/word/2010/wordprocessingGroup" xmlns:wpi="http://schemas.microsoft.com/office/word/2010/wordprocessingInk" xmlns:wne="http://schemas.microsoft.com/office/word/2006/wordml" xmlns:wps="http://schemas.microsoft.com/office/word/2010/wordprocessingShape"/>
 </file>
 
 <file path=word/endnotes.xml><?xml version="1.0" encoding="utf-8"?>
@@ -3687,7 +3690,7 @@
 <w:numbering xmlns:wpc="http://schemas.microsoft.com/office/word/2010/wordprocessingCanvas" xmlns:mc="http://schemas.openxmlformats.org/markup-compatibility/2006" xmlns:o="urn:schemas-microsoft-com:office:office" xmlns:r="http://schemas.openxmlformats.org/officeDocument/2006/relationships" xmlns:m="http://schemas.openxmlformats.org/officeDocument/2006/math" xmlns:v="urn:schemas-microsoft-com:vml" xmlns:wp14="http://schemas.microsoft.com/office/word/2010/wordprocessingDrawing" xmlns:wp="http://schemas.openxmlformats.org/drawingml/2006/wordprocessingDrawing" xmlns:w10="urn:schemas-microsoft-com:office:word" xmlns:w="http://schemas.openxmlformats.org/wordprocessingml/2006/main" xmlns:w14="http://schemas.microsoft.com/office/word/2010/wordml" xmlns:w15="http://schemas.microsoft.com/office/word/2012/wordml" xmlns:wpg="http://schemas.microsoft.com/office/word/2010/wordprocessingGroup" xmlns:wpi="http://schemas.microsoft.com/office/word/2010/wordprocessingInk" xmlns:wne="http://schemas.microsoft.com/office/word/2006/wordml" xmlns:wps="http://schemas.microsoft.com/office/word/2010/wordprocessingShape" mc:Ignorable="w14 w15 wp14">
   <w:abstractNum w:abstractNumId="1" w15:restartNumberingAfterBreak="0">
     <w:multiLevelType w:val="hybridMultilevel"/>
-    <w:lvl w:ilvl="0" w15:tentative="1">
+    <w:lvl w:ilvl="0" w:tentative="1">
       <w:start w:val="1"/>
       <w:numFmt w:val="bullet"/>
       <w:lvlText w:val="●"/>
@@ -3696,7 +3699,7 @@
         <w:ind w:left="720" w:hanging="360"/>
       </w:pPr>
     </w:lvl>
-    <w:lvl w:ilvl="1" w15:tentative="1">
+    <w:lvl w:ilvl="1" w:tentative="1">
       <w:start w:val="1"/>
       <w:numFmt w:val="bullet"/>
       <w:lvlText w:val="○"/>
@@ -3705,7 +3708,7 @@
         <w:ind w:left="1440" w:hanging="360"/>
       </w:pPr>
     </w:lvl>
-    <w:lvl w:ilvl="2" w15:tentative="1">
+    <w:lvl w:ilvl="2" w:tentative="1">
       <w:start w:val="1"/>
       <w:numFmt w:val="bullet"/>
       <w:lvlText w:val="■"/>
@@ -3714,7 +3717,7 @@
         <w:ind w:left="2160" w:hanging="360"/>
       </w:pPr>
     </w:lvl>
-    <w:lvl w:ilvl="3" w15:tentative="1">
+    <w:lvl w:ilvl="3" w:tentative="1">
       <w:start w:val="1"/>
       <w:numFmt w:val="bullet"/>
       <w:lvlText w:val="●"/>
@@ -3723,7 +3726,7 @@
         <w:ind w:left="2880" w:hanging="360"/>
       </w:pPr>
     </w:lvl>
-    <w:lvl w:ilvl="4" w15:tentative="1">
+    <w:lvl w:ilvl="4" w:tentative="1">
       <w:start w:val="1"/>
       <w:numFmt w:val="bullet"/>
       <w:lvlText w:val="○"/>
@@ -3732,7 +3735,7 @@
         <w:ind w:left="3600" w:hanging="360"/>
       </w:pPr>
     </w:lvl>
-    <w:lvl w:ilvl="5" w15:tentative="1">
+    <w:lvl w:ilvl="5" w:tentative="1">
       <w:start w:val="1"/>
       <w:numFmt w:val="bullet"/>
       <w:lvlText w:val="■"/>
@@ -3741,7 +3744,7 @@
         <w:ind w:left="4320" w:hanging="360"/>
       </w:pPr>
     </w:lvl>
-    <w:lvl w:ilvl="6" w15:tentative="1">
+    <w:lvl w:ilvl="6" w:tentative="1">
       <w:start w:val="1"/>
       <w:numFmt w:val="bullet"/>
       <w:lvlText w:val="●"/>
@@ -3750,7 +3753,7 @@
         <w:ind w:left="5040" w:hanging="360"/>
       </w:pPr>
     </w:lvl>
-    <w:lvl w:ilvl="7" w15:tentative="1">
+    <w:lvl w:ilvl="7" w:tentative="1">
       <w:start w:val="1"/>
       <w:numFmt w:val="bullet"/>
       <w:lvlText w:val="●"/>
@@ -3759,7 +3762,7 @@
         <w:ind w:left="5760" w:hanging="360"/>
       </w:pPr>
     </w:lvl>
-    <w:lvl w:ilvl="8" w15:tentative="1">
+    <w:lvl w:ilvl="8" w:tentative="1">
       <w:start w:val="1"/>
       <w:numFmt w:val="bullet"/>
       <w:lvlText w:val="●"/>
@@ -3771,7 +3774,7 @@
   </w:abstractNum>
   <w:abstractNum w:abstractNumId="2" w15:restartNumberingAfterBreak="0">
     <w:multiLevelType w:val="hybridMultilevel"/>
-    <w:lvl w:ilvl="0" w15:tentative="1">
+    <w:lvl w:ilvl="0" w:tentative="1">
       <w:start w:val="1"/>
       <w:numFmt w:val="bullet"/>
       <w:lvlText w:val="•"/>
@@ -3802,6 +3805,10 @@
     <w:rPrDefault/>
     <w:pPrDefault/>
   </w:docDefaults>
+  <w:style w:type="paragraph" w:styleId="Normal" w:default="1">
+    <w:name w:val="Normal"/>
+    <w:qFormat/>
+  </w:style>
   <w:style w:type="paragraph" w:styleId="Title">
     <w:name w:val="Title"/>
     <w:basedOn w:val="Normal"/>
@@ -3974,4 +3981,294 @@
     </w:rPr>
   </w:style>
 </w:styles>
+</file>
+
+<file path=word/theme/theme1.xml><?xml version="1.0" encoding="utf-8"?>
+<a:theme xmlns:a="http://schemas.openxmlformats.org/drawingml/2006/main" name="Office Theme">
+  <a:themeElements>
+    <a:clrScheme name="Office">
+      <a:dk1>
+        <a:sysClr val="windowText" lastClr="000000"/>
+      </a:dk1>
+      <a:lt1>
+        <a:sysClr val="window" lastClr="FFFFFF"/>
+      </a:lt1>
+      <a:dk2>
+        <a:srgbClr val="44546A"/>
+      </a:dk2>
+      <a:lt2>
+        <a:srgbClr val="E7E6E6"/>
+      </a:lt2>
+      <a:accent1>
+        <a:srgbClr val="4472C4"/>
+      </a:accent1>
+      <a:accent2>
+        <a:srgbClr val="ED7D31"/>
+      </a:accent2>
+      <a:accent3>
+        <a:srgbClr val="A5A5A5"/>
+      </a:accent3>
+      <a:accent4>
+        <a:srgbClr val="FFC000"/>
+      </a:accent4>
+      <a:accent5>
+        <a:srgbClr val="5B9BD5"/>
+      </a:accent5>
+      <a:accent6>
+        <a:srgbClr val="70AD47"/>
+      </a:accent6>
+      <a:hlink>
+        <a:srgbClr val="0563C1"/>
+      </a:hlink>
+      <a:folHlink>
+        <a:srgbClr val="954F72"/>
+      </a:folHlink>
+    </a:clrScheme>
+    <a:fontScheme name="Office">
+      <a:majorFont>
+        <a:latin typeface="Calibri Light" panose="020F0302020204030204"/>
+        <a:ea typeface=""/>
+        <a:cs typeface=""/>
+        <a:font script="Jpan" typeface="游ゴシック Light"/>
+        <a:font script="Hang" typeface="맑은 고딕"/>
+        <a:font script="Hans" typeface="等线 Light"/>
+        <a:font script="Hant" typeface="新細明體"/>
+        <a:font script="Arab" typeface="Times New Roman"/>
+        <a:font script="Hebr" typeface="Times New Roman"/>
+        <a:font script="Thai" typeface="Angsana New"/>
+        <a:font script="Ethi" typeface="Nyala"/>
+        <a:font script="Beng" typeface="Vrinda"/>
+        <a:font script="Gujr" typeface="Shruti"/>
+        <a:font script="Khmr" typeface="MoolBoran"/>
+        <a:font script="Knda" typeface="Tunga"/>
+        <a:font script="Guru" typeface="Raavi"/>
+        <a:font script="Cans" typeface="Euphemia"/>
+        <a:font script="Cher" typeface="Plantagenet Cherokee"/>
+        <a:font script="Yiii" typeface="Microsoft Yi Baiti"/>
+        <a:font script="Tibt" typeface="Microsoft Himalaya"/>
+        <a:font script="Thaa" typeface="MV Boli"/>
+        <a:font script="Deva" typeface="Mangal"/>
+        <a:font script="Telu" typeface="Gautami"/>
+        <a:font script="Taml" typeface="Latha"/>
+        <a:font script="Syrc" typeface="Estrangelo Edessa"/>
+        <a:font script="Orya" typeface="Kalinga"/>
+        <a:font script="Mlym" typeface="Kartika"/>
+        <a:font script="Laoo" typeface="DokChampa"/>
+        <a:font script="Sinh" typeface="Iskoola Pota"/>
+        <a:font script="Mong" typeface="Mongolian Baiti"/>
+        <a:font script="Viet" typeface="Times New Roman"/>
+        <a:font script="Uigh" typeface="Microsoft Uighur"/>
+        <a:font script="Geor" typeface="Sylfaen"/>
+        <a:font script="Armn" typeface="Arial"/>
+        <a:font script="Bugi" typeface="Leelawadee UI"/>
+        <a:font script="Bopo" typeface="Microsoft JhengHei"/>
+        <a:font script="Java" typeface="Javanese Text"/>
+        <a:font script="Lisu" typeface="Segoe UI"/>
+        <a:font script="Mymr" typeface="Myanmar Text"/>
+        <a:font script="Nkoo" typeface="Ebrima"/>
+        <a:font script="Olck" typeface="Nirmala UI"/>
+        <a:font script="Osma" typeface="Ebrima"/>
+        <a:font script="Phag" typeface="Phagspa"/>
+        <a:font script="Syrn" typeface="Estrangelo Edessa"/>
+        <a:font script="Syrj" typeface="Estrangelo Edessa"/>
+        <a:font script="Syre" typeface="Estrangelo Edessa"/>
+        <a:font script="Sora" typeface="Nirmala UI"/>
+        <a:font script="Tale" typeface="Microsoft Tai Le"/>
+        <a:font script="Talu" typeface="Microsoft New Tai Lue"/>
+        <a:font script="Tfng" typeface="Ebrima"/>
+      </a:majorFont>
+      <a:minorFont>
+        <a:latin typeface="Calibri" panose="020F0502020204030204"/>
+        <a:ea typeface=""/>
+        <a:cs typeface=""/>
+        <a:font script="Jpan" typeface="游明朝"/>
+        <a:font script="Hang" typeface="맑은 고딕"/>
+        <a:font script="Hans" typeface="等线"/>
+        <a:font script="Hant" typeface="新細明體"/>
+        <a:font script="Arab" typeface="Arial"/>
+        <a:font script="Hebr" typeface="Arial"/>
+        <a:font script="Thai" typeface="Cordia New"/>
+        <a:font script="Ethi" typeface="Nyala"/>
+        <a:font script="Beng" typeface="Vrinda"/>
+        <a:font script="Gujr" typeface="Shruti"/>
+        <a:font script="Khmr" typeface="DaunPenh"/>
+        <a:font script="Knda" typeface="Tunga"/>
+        <a:font script="Guru" typeface="Raavi"/>
+        <a:font script="Cans" typeface="Euphemia"/>
+        <a:font script="Cher" typeface="Plantagenet Cherokee"/>
+        <a:font script="Yiii" typeface="Microsoft Yi Baiti"/>
+        <a:font script="Tibt" typeface="Microsoft Himalaya"/>
+        <a:font script="Thaa" typeface="MV Boli"/>
+        <a:font script="Deva" typeface="Mangal"/>
+        <a:font script="Telu" typeface="Gautami"/>
+        <a:font script="Taml" typeface="Latha"/>
+        <a:font script="Syrc" typeface="Estrangelo Edessa"/>
+        <a:font script="Orya" typeface="Kalinga"/>
+        <a:font script="Mlym" typeface="Kartika"/>
+        <a:font script="Laoo" typeface="DokChampa"/>
+        <a:font script="Sinh" typeface="Iskoola Pota"/>
+        <a:font script="Mong" typeface="Mongolian Baiti"/>
+        <a:font script="Viet" typeface="Arial"/>
+        <a:font script="Uigh" typeface="Microsoft Uighur"/>
+        <a:font script="Geor" typeface="Sylfaen"/>
+        <a:font script="Armn" typeface="Arial"/>
+        <a:font script="Bugi" typeface="Leelawadee UI"/>
+        <a:font script="Bopo" typeface="Microsoft JhengHei"/>
+        <a:font script="Java" typeface="Javanese Text"/>
+        <a:font script="Lisu" typeface="Segoe UI"/>
+        <a:font script="Mymr" typeface="Myanmar Text"/>
+        <a:font script="Nkoo" typeface="Ebrima"/>
+        <a:font script="Olck" typeface="Nirmala UI"/>
+        <a:font script="Osma" typeface="Ebrima"/>
+        <a:font script="Phag" typeface="Phagspa"/>
+        <a:font script="Syrn" typeface="Estrangelo Edessa"/>
+        <a:font script="Syrj" typeface="Estrangelo Edessa"/>
+        <a:font script="Syre" typeface="Estrangelo Edessa"/>
+        <a:font script="Sora" typeface="Nirmala UI"/>
+        <a:font script="Tale" typeface="Microsoft Tai Le"/>
+        <a:font script="Talu" typeface="Microsoft New Tai Lue"/>
+        <a:font script="Tfng" typeface="Ebrima"/>
+      </a:minorFont>
+    </a:fontScheme>
+    <a:fmtScheme name="Office">
+      <a:fillStyleLst>
+        <a:solidFill>
+          <a:schemeClr val="phClr"/>
+        </a:solidFill>
+        <a:gradFill rotWithShape="true">
+          <a:gsLst>
+            <a:gs pos="0">
+              <a:schemeClr val="phClr">
+                <a:lumMod val="110000"/>
+                <a:satMod val="105000"/>
+                <a:tint val="67000"/>
+              </a:schemeClr>
+            </a:gs>
+            <a:gs pos="50000">
+              <a:schemeClr val="phClr">
+                <a:lumMod val="105000"/>
+                <a:satMod val="103000"/>
+                <a:tint val="73000"/>
+              </a:schemeClr>
+            </a:gs>
+            <a:gs pos="100000">
+              <a:schemeClr val="phClr">
+                <a:lumMod val="105000"/>
+                <a:satMod val="109000"/>
+                <a:tint val="81000"/>
+              </a:schemeClr>
+            </a:gs>
+          </a:gsLst>
+          <a:lin ang="5400000" scaled="false"/>
+        </a:gradFill>
+        <a:gradFill rotWithShape="true">
+          <a:gsLst>
+            <a:gs pos="0">
+              <a:schemeClr val="phClr">
+                <a:satMod val="103000"/>
+                <a:lumMod val="102000"/>
+                <a:tint val="94000"/>
+              </a:schemeClr>
+            </a:gs>
+            <a:gs pos="50000">
+              <a:schemeClr val="phClr">
+                <a:satMod val="110000"/>
+                <a:lumMod val="100000"/>
+                <a:shade val="100000"/>
+              </a:schemeClr>
+            </a:gs>
+            <a:gs pos="100000">
+              <a:schemeClr val="phClr">
+                <a:lumMod val="99000"/>
+                <a:satMod val="120000"/>
+                <a:shade val="78000"/>
+              </a:schemeClr>
+            </a:gs>
+          </a:gsLst>
+          <a:lin ang="5400000" scaled="false"/>
+        </a:gradFill>
+      </a:fillStyleLst>
+      <a:lnStyleLst>
+        <a:ln w="6350" cap="flat" cmpd="sng" algn="ctr">
+          <a:solidFill>
+            <a:schemeClr val="phClr"/>
+          </a:solidFill>
+          <a:prstDash val="solid"/>
+          <a:miter lim="800000"/>
+        </a:ln>
+        <a:ln w="12700" cap="flat" cmpd="sng" algn="ctr">
+          <a:solidFill>
+            <a:schemeClr val="phClr"/>
+          </a:solidFill>
+          <a:prstDash val="solid"/>
+          <a:miter lim="800000"/>
+        </a:ln>
+        <a:ln w="19050" cap="flat" cmpd="sng" algn="ctr">
+          <a:solidFill>
+            <a:schemeClr val="phClr"/>
+          </a:solidFill>
+          <a:prstDash val="solid"/>
+          <a:miter lim="800000"/>
+        </a:ln>
+      </a:lnStyleLst>
+      <a:effectStyleLst>
+        <a:effectStyle>
+          <a:effectLst/>
+        </a:effectStyle>
+        <a:effectStyle>
+          <a:effectLst/>
+        </a:effectStyle>
+        <a:effectStyle>
+          <a:effectLst>
+            <a:outerShdw blurRad="57150" dist="19050" dir="5400000" algn="ctr" rotWithShape="false">
+              <a:srgbClr val="000000">
+                <a:alpha val="63000"/>
+              </a:srgbClr>
+            </a:outerShdw>
+          </a:effectLst>
+        </a:effectStyle>
+      </a:effectStyleLst>
+      <a:bgFillStyleLst>
+        <a:solidFill>
+          <a:schemeClr val="phClr"/>
+        </a:solidFill>
+        <a:solidFill>
+          <a:schemeClr val="phClr">
+            <a:tint val="95000"/>
+            <a:satMod val="170000"/>
+          </a:schemeClr>
+        </a:solidFill>
+        <a:gradFill rotWithShape="true">
+          <a:gsLst>
+            <a:gs pos="0">
+              <a:schemeClr val="phClr">
+                <a:tint val="93000"/>
+                <a:satMod val="150000"/>
+                <a:shade val="98000"/>
+                <a:lumMod val="102000"/>
+              </a:schemeClr>
+            </a:gs>
+            <a:gs pos="50000">
+              <a:schemeClr val="phClr">
+                <a:tint val="98000"/>
+                <a:satMod val="130000"/>
+                <a:shade val="90000"/>
+                <a:lumMod val="103000"/>
+              </a:schemeClr>
+            </a:gs>
+            <a:gs pos="100000">
+              <a:schemeClr val="phClr">
+                <a:shade val="63000"/>
+                <a:satMod val="120000"/>
+              </a:schemeClr>
+            </a:gs>
+          </a:gsLst>
+          <a:lin ang="5400000" scaled="false"/>
+        </a:gradFill>
+      </a:bgFillStyleLst>
+    </a:fmtScheme>
+  </a:themeElements>
+  <a:objectDefaults/>
+  <a:extraClrSchemeLst/>
+</a:theme>
 </file>
</xml_diff>